<commit_message>
Regenerate detailed LASSO and model reports
Co-authored-by: dreamcheap2000 <229635625+dreamcheap2000@users.noreply.github.com>
</commit_message>
<xml_diff>
--- a/202608310_Appraise_1029.docx
+++ b/202608310_Appraise_1029.docx
@@ -15,7 +15,7 @@
         <w:rPr>
           <w:sz w:val="18"/>
         </w:rPr>
-        <w:t>Data context: appraised from prior-session artifacts on the latest patient dataset lineage anchored by 20260831_LASSO_0802.xlsx.</w:t>
+        <w:t>Data context: appraised from prior-session artifacts on the latest patient dataset lineage anchored by 20260831_LASSO_1047.xlsx.</w:t>
       </w:r>
     </w:p>
     <w:p>
@@ -32,6 +32,14 @@
           <w:sz w:val="18"/>
         </w:rPr>
         <w:t>Model dependence on functional variables: the weakest model is Model 6 (reference – original Model 2): demographic + stroke info + comorbidities + acute complications + NIHSS out (CV R²=0.2442), reinforcing that neurological/comorbidity predictors alone are insufficient for accurate 6MWT4 prediction.</w:t>
+      </w:r>
+    </w:p>
+    <w:p>
+      <w:r>
+        <w:rPr>
+          <w:sz w:val="18"/>
+        </w:rPr>
+        <w:t>Feature-importance consistency: BBS1, age, gait speed, and sex remain recurrent high-stability drivers across the stronger LASSO specifications, supporting their role as the main explanatory anchors.</w:t>
       </w:r>
     </w:p>
     <w:p>

</xml_diff>